<commit_message>
Desenvolvimento quiz, dashboard com dados, ajustes na home, página de galeria
</commit_message>
<xml_diff>
--- a/Documentacao/Documentação-Projeto Individual.docx
+++ b/Documentacao/Documentação-Projeto Individual.docx
@@ -559,7 +559,14 @@
           <w:b/>
           <w:bCs/>
         </w:rPr>
-        <w:t>Página de Indicações</w:t>
+        <w:t xml:space="preserve">Página de </w:t>
+      </w:r>
+      <w:r>
+        <w:rPr>
+          <w:b/>
+          <w:bCs/>
+        </w:rPr>
+        <w:t>Dicas</w:t>
       </w:r>
     </w:p>
     <w:p>
@@ -684,7 +691,10 @@
         <w:ind w:firstLine="0"/>
       </w:pPr>
       <w:r>
-        <w:t>Após realizar login, o usuário poderá acessar um quiz com perguntas sobre Barcelona.</w:t>
+        <w:t xml:space="preserve">Após realizar login, o usuário poderá acessar um quiz </w:t>
+      </w:r>
+      <w:r>
+        <w:t>para ver qual tipo de turista ele é</w:t>
       </w:r>
     </w:p>
     <w:p>
@@ -725,28 +735,7 @@
         <w:t xml:space="preserve"> </w:t>
       </w:r>
       <w:r>
-        <w:t>Épocas do ano com maior número de turistas</w:t>
-      </w:r>
-      <w:r>
-        <w:t>, p</w:t>
-      </w:r>
-      <w:r>
-        <w:t>eríodos mais tranquilos</w:t>
-      </w:r>
-      <w:r>
-        <w:t>, v</w:t>
-      </w:r>
-      <w:r>
-        <w:t>ariação de temperatura</w:t>
-      </w:r>
-      <w:r>
-        <w:t>, i</w:t>
-      </w:r>
-      <w:r>
-        <w:t>nformações úteis para planejamento de viagem</w:t>
-      </w:r>
-      <w:r>
-        <w:t>.</w:t>
+        <w:t>Quais tipos de turistas são os mais comuns, a porcentagem de cada, qual é o menos comum, qual está em maior crescimento e qual está em maior queda</w:t>
       </w:r>
     </w:p>
     <w:p>
@@ -962,12 +951,6 @@
         <w:t>Responsividade completa para dispositivos móveis (o site será otimizado para uso em computadores)</w:t>
       </w:r>
       <w:r>
-        <w:t>, i</w:t>
-      </w:r>
-      <w:r>
-        <w:t>ntegração com dados em tempo real</w:t>
-      </w:r>
-      <w:r>
         <w:t>.</w:t>
       </w:r>
     </w:p>
@@ -1015,15 +998,7 @@
         <w:t>I</w:t>
       </w:r>
       <w:r>
-        <w:t xml:space="preserve">nício da documentação + configuração do </w:t>
-      </w:r>
-      <w:proofErr w:type="spellStart"/>
-      <w:r>
-        <w:t>Git</w:t>
-      </w:r>
-      <w:proofErr w:type="spellEnd"/>
-      <w:r>
-        <w:t xml:space="preserve"> – Semana 2 </w:t>
+        <w:t xml:space="preserve">nício da documentação + configuração do Git – Semana 2 </w:t>
       </w:r>
     </w:p>
     <w:p>
@@ -1091,26 +1066,10 @@
         <w:t>, f</w:t>
       </w:r>
       <w:r>
-        <w:t xml:space="preserve">erramentas: HTML, CSS, </w:t>
-      </w:r>
-      <w:proofErr w:type="spellStart"/>
-      <w:r>
-        <w:t>JavaScript</w:t>
-      </w:r>
-      <w:proofErr w:type="spellEnd"/>
-      <w:r>
-        <w:t>, banco de dados, GitHub</w:t>
-      </w:r>
-      <w:r>
-        <w:t xml:space="preserve"> e </w:t>
-      </w:r>
-      <w:proofErr w:type="spellStart"/>
-      <w:r>
-        <w:t>Trello</w:t>
-      </w:r>
-      <w:proofErr w:type="spellEnd"/>
-      <w:r>
-        <w:t>.</w:t>
+        <w:t>erramentas: HTML, CSS, JavaScript, banco de dados, GitHub</w:t>
+      </w:r>
+      <w:r>
+        <w:t xml:space="preserve"> e Trello.</w:t>
       </w:r>
     </w:p>
     <w:p>
@@ -1135,17 +1094,13 @@
       <w:pPr>
         <w:ind w:firstLine="0"/>
         <w:jc w:val="left"/>
-        <w:rPr>
-          <w:b/>
-          <w:bCs/>
-        </w:rPr>
-      </w:pPr>
-      <w:r>
-        <w:rPr>
-          <w:b/>
-          <w:bCs/>
-        </w:rPr>
-        <w:t>Riscos</w:t>
+      </w:pPr>
+      <w:r>
+        <w:rPr>
+          <w:b/>
+          <w:bCs/>
+        </w:rPr>
+        <w:t>Restrições</w:t>
       </w:r>
     </w:p>
     <w:p>
@@ -1154,32 +1109,7 @@
         <w:jc w:val="left"/>
       </w:pPr>
       <w:r>
-        <w:t xml:space="preserve">Problemas no funcionamento do sistema de login </w:t>
-      </w:r>
-    </w:p>
-    <w:p>
-      <w:pPr>
-        <w:ind w:firstLine="0"/>
-        <w:jc w:val="left"/>
-      </w:pPr>
-      <w:r>
-        <w:rPr>
-          <w:b/>
-          <w:bCs/>
-        </w:rPr>
-        <w:t>Restrições</w:t>
-      </w:r>
-    </w:p>
-    <w:p>
-      <w:pPr>
-        <w:ind w:firstLine="0"/>
-        <w:jc w:val="left"/>
-      </w:pPr>
-      <w:r>
-        <w:t>Dashboard com dados estáticos</w:t>
-      </w:r>
-      <w:r>
-        <w:t>, s</w:t>
+        <w:t>S</w:t>
       </w:r>
       <w:r>
         <w:t>istema configurado prioritariamente para telas de computador, podendo não apresentar boa responsividade em dispositivos móveis</w:t>
@@ -3723,6 +3653,7 @@
   <w:style w:type="character" w:default="1" w:styleId="Fontepargpadro">
     <w:name w:val="Default Paragraph Font"/>
     <w:uiPriority w:val="1"/>
+    <w:semiHidden/>
     <w:unhideWhenUsed/>
   </w:style>
   <w:style w:type="table" w:default="1" w:styleId="Tabelanormal">
@@ -3911,6 +3842,7 @@
       <w:numPr>
         <w:ilvl w:val="1"/>
       </w:numPr>
+      <w:ind w:firstLine="709"/>
     </w:pPr>
     <w:rPr>
       <w:rFonts w:eastAsiaTheme="majorEastAsia" w:cstheme="majorBidi"/>

</xml_diff>